<commit_message>
Complete reporting and role dashboards
</commit_message>
<xml_diff>
--- a/exports/ATPLCRM_Implementation_Plan.docx
+++ b/exports/ATPLCRM_Implementation_Plan.docx
@@ -526,7 +526,7 @@
                 <w:color w:val="0B1F33"/>
                 <w:sz w:val="15"/>
               </w:rPr>
-              <w:t>v0.7 working core with synthetic local data; not yet production-ready or PRD-complete</w:t>
+              <w:t>v0.14 working core with synthetic local data; reporting, pipeline, commercial, relationships, imports, pre-sales and documents complete locally; Azure production acceptance remains</w:t>
             </w:r>
           </w:p>
         </w:tc>
@@ -4587,7 +4587,7 @@
                 <w:color w:val="0B1F33"/>
                 <w:sz w:val="15"/>
               </w:rPr>
-              <w:t>Time filters, historical funnel, losses, blockers, erosion, partner/movement/performance, server exports, Excel and configuration parity</w:t>
+              <w:t>Local analytics complete: role dashboards, filtered pipeline and forecast, historical funnel, blockers, outcomes, erosion, movement, performance, drill-down, CSV and Excel. Connected-scale reconciliation remains.</w:t>
             </w:r>
           </w:p>
         </w:tc>

</xml_diff>